<commit_message>
feat(agb): Ziffer 3 c) höhere Gewalt und 14 Haftungsgrenze € 1.000 an CZ-Fassung angeglichen
Co-Authored-By: Claude Opus 5.5 <noreply@anthropic.com>
</commit_message>
<xml_diff>
--- a/docs/agb/verkaufs-und-lieferbedingungen-2023-de.docx
+++ b/docs/agb/verkaufs-und-lieferbedingungen-2023-de.docx
@@ -439,32 +439,32 @@
           <w:szCs w:val="16"/>
           <w:lang w:val="de-AT"/>
         </w:rPr>
-        <w:t xml:space="preserve">c) Die Lieferfrist verlängert sich angemessen bei Eintritt unvorhergesehener Hindernisse, die außerhalb des Willens des Lieferers liegen – gleichviel ob im Werk des Lieferers oder bei seinen Unterlieferern eingetreten – zum Beispiel Betriebsstörungen, Ausschusswerden, Verzögerungen in der Anlieferung wesentlicher Roh- und Baustoffe, Ausfall eines in einer Schlüsselposition tätigen Mitarbeiters, Streik und Aussperrung soweit solche Hindernisse nachweislich auf die Fertigstellung oder Ablieferung des Liefergegenstandes von erheblichem Einfluß sind.</w:t>
-      </w:r>
-    </w:p>
-    <w:p>
-      <w:pPr>
-        <w:pBdr>
-          <w:bar w:val="single" w:sz="4" w:color="auto"/>
-        </w:pBdr>
-        <w:tabs>
-          <w:tab w:val="left" w:pos="210"/>
-        </w:tabs>
-        <w:rPr>
-          <w:rFonts w:ascii="Arial" w:hAnsi="Arial" w:cs="Arial"/>
-          <w:sz w:val="16"/>
-          <w:szCs w:val="16"/>
-          <w:lang w:val="de-AT"/>
-        </w:rPr>
-      </w:pPr>
-      <w:r>
-        <w:rPr>
-          <w:rFonts w:ascii="Arial" w:hAnsi="Arial" w:cs="Arial"/>
-          <w:sz w:val="16"/>
-          <w:szCs w:val="16"/>
-          <w:lang w:val="de-AT"/>
-        </w:rPr>
-        <w:t xml:space="preserve">Die vorbezeichneten Umstände sind auch dann vom Lieferer nicht zu vertreten, wenn sie während eines bereits vorliegenden Verzugs entstehen. Beginn und Ende derartiger Hindernisse wird in wichtigen Fällen der Lieferer dem Besteller baldmöglichst mitteilen.</w:t>
+        <w:t xml:space="preserve">c) Die Lieferfrist verlängert sich angemessen bei Eintritt unvorhergesehener Hindernisse (höhere Gewalt), die außerhalb des Willens und der zumutbaren Kontrolle des Lieferers liegen und deren Folgen der Lieferer nicht abwenden oder überwinden kann – gleichviel ob beim Lieferer oder bei seinen Unterlieferern eingetreten. Bei folgenden Ereignissen wird höhere Gewalt jedenfalls bis zum Beweis des Gegenteils vermutet: Krieg (erklärt oder nicht erklärt), Bürgerkrieg, Unruhen, Terrorakte, Sabotage, Handelsbeschränkungen, Embargo, Sanktionen, Epidemien, Befolgung von Gesetzen oder behördlichen Anordnungen, extreme Naturereignisse, Naturkatastrophen, länger andauernder Ausfall von Informationssystemen oder der Stromversorgung, Brand, Zerstörung von Anlagen, Verzögerungen in der Anlieferung wesentlicher Roh- und Baustoffe, Ausfall eines in einer Schlüsselposition tätigen Mitarbeiters, Arbeitskämpfe wie Streik und Aussperrung, soweit solche Hindernisse nachweislich auf die Fertigstellung oder Ablieferung des Liefergegenstandes von erheblichem Einfluß sind.</w:t>
+      </w:r>
+    </w:p>
+    <w:p>
+      <w:pPr>
+        <w:pBdr>
+          <w:bar w:val="single" w:sz="4" w:color="auto"/>
+        </w:pBdr>
+        <w:tabs>
+          <w:tab w:val="left" w:pos="210"/>
+        </w:tabs>
+        <w:rPr>
+          <w:rFonts w:ascii="Arial" w:hAnsi="Arial" w:cs="Arial"/>
+          <w:sz w:val="16"/>
+          <w:szCs w:val="16"/>
+          <w:lang w:val="de-AT"/>
+        </w:rPr>
+      </w:pPr>
+      <w:r>
+        <w:rPr>
+          <w:rFonts w:ascii="Arial" w:hAnsi="Arial" w:cs="Arial"/>
+          <w:sz w:val="16"/>
+          <w:szCs w:val="16"/>
+          <w:lang w:val="de-AT"/>
+        </w:rPr>
+        <w:t xml:space="preserve">Die vorbezeichneten Umstände berechtigen den Besteller nicht zur Geltendmachung von Schadenersatz oder Vertragsstrafen und sind auch dann vom Lieferer nicht zu vertreten, wenn sie während eines bereits vorliegenden Verzugs entstehen. Beginn und Ende derartiger Hindernisse wird in wichtigen Fällen der Lieferer dem Besteller baldmöglichst mitteilen. Der Lieferer wird alle zumutbaren Maßnahmen ergreifen, um die Auswirkungen eingetretener unvorhergesehener Hindernisse zu begrenzen.</w:t>
       </w:r>
     </w:p>
     <w:p>
@@ -2466,7 +2466,7 @@
           <w:szCs w:val="16"/>
           <w:lang w:val="de-AT"/>
         </w:rPr>
-        <w:t xml:space="preserve">Die Haftung des Lieferers ist pro Schadensfall mit € 500,00 begrenzt.</w:t>
+        <w:t xml:space="preserve">Die Haftung des Lieferers ist pro Schadensfall mit € 1.000,00 begrenzt.</w:t>
       </w:r>
     </w:p>
     <w:p>

</xml_diff>